<commit_message>
:books: docs: Atualização da documentação position
</commit_message>
<xml_diff>
--- a/Documents/Documents/Sprint07_Task081_Implementar_Validacoes_para_a_Classe_Position.docx
+++ b/Documents/Documents/Sprint07_Task081_Implementar_Validacoes_para_a_Classe_Position.docx
@@ -1,6 +1,6 @@
 
 <file path=word/document.xml><?xml version="1.0" encoding="utf-8"?>
-<w:document xmlns:wpc="http://schemas.microsoft.com/office/word/2010/wordprocessingCanvas" xmlns:cx="http://schemas.microsoft.com/office/drawing/2014/chartex" xmlns:cx1="http://schemas.microsoft.com/office/drawing/2015/9/8/chartex" xmlns:cx2="http://schemas.microsoft.com/office/drawing/2015/10/21/chartex" xmlns:cx3="http://schemas.microsoft.com/office/drawing/2016/5/9/chartex" xmlns:cx4="http://schemas.microsoft.com/office/drawing/2016/5/10/chartex" xmlns:cx5="http://schemas.microsoft.com/office/drawing/2016/5/11/chartex" xmlns:cx6="http://schemas.microsoft.com/office/drawing/2016/5/12/chartex" xmlns:cx7="http://schemas.microsoft.com/office/drawing/2016/5/13/chartex" xmlns:cx8="http://schemas.microsoft.com/office/drawing/2016/5/14/chartex" xmlns:mc="http://schemas.openxmlformats.org/markup-compatibility/2006" xmlns:aink="http://schemas.microsoft.com/office/drawing/2016/ink" xmlns:am3d="http://schemas.microsoft.com/office/drawing/2017/model3d" xmlns:o="urn:schemas-microsoft-com:office:office" xmlns:oel="http://schemas.microsoft.com/office/2019/extlst" xmlns:r="http://schemas.openxmlformats.org/officeDocument/2006/relationships" xmlns:m="http://schemas.openxmlformats.org/officeDocument/2006/math" xmlns:v="urn:schemas-microsoft-com:vml" xmlns:wp14="http://schemas.microsoft.com/office/word/2010/wordprocessingDrawing" xmlns:wp="http://schemas.openxmlformats.org/drawingml/2006/wordprocessingDrawing" xmlns:w10="urn:schemas-microsoft-com:office:word" xmlns:w="http://schemas.openxmlformats.org/wordprocessingml/2006/main" xmlns:w14="http://schemas.microsoft.com/office/word/2010/wordml" xmlns:w15="http://schemas.microsoft.com/office/word/2012/wordml" xmlns:w16cex="http://schemas.microsoft.com/office/word/2018/wordml/cex" xmlns:w16cid="http://schemas.microsoft.com/office/word/2016/wordml/cid" xmlns:w16="http://schemas.microsoft.com/office/word/2018/wordml" xmlns:w16du="http://schemas.microsoft.com/office/word/2023/wordml/word16du" xmlns:w16sdtdh="http://schemas.microsoft.com/office/word/2020/wordml/sdtdatahash" xmlns:w16sdtfl="http://schemas.microsoft.com/office/word/2024/wordml/sdtformatlock" xmlns:w16se="http://schemas.microsoft.com/office/word/2015/wordml/symex" xmlns:wpg="http://schemas.microsoft.com/office/word/2010/wordprocessingGroup" xmlns:wpi="http://schemas.microsoft.com/office/word/2010/wordprocessingInk" xmlns:wne="http://schemas.microsoft.com/office/word/2006/wordml" xmlns:wps="http://schemas.microsoft.com/office/word/2010/wordprocessingShape" mc:Ignorable="w14 w15 w16se w16cid w16 w16cex w16sdtdh w16sdtfl w16du wp14">
+<w:document xmlns:wpc="http://schemas.microsoft.com/office/word/2010/wordprocessingCanvas" xmlns:cx="http://schemas.microsoft.com/office/drawing/2014/chartex" xmlns:cx1="http://schemas.microsoft.com/office/drawing/2015/9/8/chartex" xmlns:cx2="http://schemas.microsoft.com/office/drawing/2015/10/21/chartex" xmlns:cx3="http://schemas.microsoft.com/office/drawing/2016/5/9/chartex" xmlns:cx4="http://schemas.microsoft.com/office/drawing/2016/5/10/chartex" xmlns:cx5="http://schemas.microsoft.com/office/drawing/2016/5/11/chartex" xmlns:cx6="http://schemas.microsoft.com/office/drawing/2016/5/12/chartex" xmlns:cx7="http://schemas.microsoft.com/office/drawing/2016/5/13/chartex" xmlns:cx8="http://schemas.microsoft.com/office/drawing/2016/5/14/chartex" xmlns:mc="http://schemas.openxmlformats.org/markup-compatibility/2006" xmlns:aink="http://schemas.microsoft.com/office/drawing/2016/ink" xmlns:am3d="http://schemas.microsoft.com/office/drawing/2017/model3d" xmlns:o="urn:schemas-microsoft-com:office:office" xmlns:r="http://schemas.openxmlformats.org/officeDocument/2006/relationships" xmlns:m="http://schemas.openxmlformats.org/officeDocument/2006/math" xmlns:v="urn:schemas-microsoft-com:vml" xmlns:wp14="http://schemas.microsoft.com/office/word/2010/wordprocessingDrawing" xmlns:wp="http://schemas.openxmlformats.org/drawingml/2006/wordprocessingDrawing" xmlns:w10="urn:schemas-microsoft-com:office:word" xmlns:w="http://schemas.openxmlformats.org/wordprocessingml/2006/main" xmlns:w14="http://schemas.microsoft.com/office/word/2010/wordml" xmlns:w15="http://schemas.microsoft.com/office/word/2012/wordml" xmlns:w16cid="http://schemas.microsoft.com/office/word/2016/wordml/cid" xmlns:w16se="http://schemas.microsoft.com/office/word/2015/wordml/symex" xmlns:wpg="http://schemas.microsoft.com/office/word/2010/wordprocessingGroup" xmlns:wpi="http://schemas.microsoft.com/office/word/2010/wordprocessingInk" xmlns:wne="http://schemas.microsoft.com/office/word/2006/wordml" xmlns:wps="http://schemas.microsoft.com/office/word/2010/wordprocessingShape" mc:Ignorable="w14 w15 w16se w16cid wp14">
   <w:body>
     <w:p>
       <w:pPr>
@@ -606,12 +606,21 @@
                 <w:bCs/>
               </w:rPr>
             </w:pPr>
-            <w:r>
-              <w:rPr>
-                <w:b/>
-                <w:bCs/>
-              </w:rPr>
-              <w:t xml:space="preserve">Task </w:t>
+            <w:proofErr w:type="spellStart"/>
+            <w:r>
+              <w:rPr>
+                <w:b/>
+                <w:bCs/>
+              </w:rPr>
+              <w:t>Task</w:t>
+            </w:r>
+            <w:proofErr w:type="spellEnd"/>
+            <w:r>
+              <w:rPr>
+                <w:b/>
+                <w:bCs/>
+              </w:rPr>
+              <w:t xml:space="preserve"> </w:t>
             </w:r>
             <w:proofErr w:type="spellStart"/>
             <w:r>
@@ -765,7 +774,7 @@
           </w:tcPr>
           <w:p>
             <w:r>
-              <w:t>4</w:t>
+              <w:t>12</w:t>
             </w:r>
           </w:p>
         </w:tc>
@@ -775,7 +784,7 @@
           </w:tcPr>
           <w:p>
             <w:r>
-              <w:t>4</w:t>
+              <w:t>12</w:t>
             </w:r>
           </w:p>
         </w:tc>
@@ -888,6 +897,107 @@
       <w:r>
         <w:t>.</w:t>
       </w:r>
+    </w:p>
+    <w:p>
+      <w:pPr>
+        <w:ind w:firstLine="708"/>
+      </w:pPr>
+      <w:r>
+        <w:t xml:space="preserve">Também foi desenvolvido as classes de execute e base para criar novas </w:t>
+      </w:r>
+      <w:proofErr w:type="spellStart"/>
+      <w:r>
+        <w:t>DataAnnotations</w:t>
+      </w:r>
+      <w:proofErr w:type="spellEnd"/>
+      <w:r>
+        <w:t xml:space="preserve"> validações de formato </w:t>
+      </w:r>
+      <w:r>
+        <w:t xml:space="preserve"> </w:t>
+      </w:r>
+      <w:r>
+        <w:t xml:space="preserve">e de validade, as validações de formato são de </w:t>
+      </w:r>
+      <w:proofErr w:type="spellStart"/>
+      <w:r>
+        <w:t>cpfCpnj</w:t>
+      </w:r>
+      <w:proofErr w:type="spellEnd"/>
+      <w:r>
+        <w:t xml:space="preserve">, </w:t>
+      </w:r>
+      <w:proofErr w:type="spellStart"/>
+      <w:r>
+        <w:t>extractNumbers</w:t>
+      </w:r>
+      <w:proofErr w:type="spellEnd"/>
+      <w:r>
+        <w:t xml:space="preserve"> </w:t>
+      </w:r>
+      <w:proofErr w:type="spellStart"/>
+      <w:r>
+        <w:t>phone</w:t>
+      </w:r>
+      <w:proofErr w:type="spellEnd"/>
+      <w:r>
+        <w:t xml:space="preserve">, </w:t>
+      </w:r>
+      <w:proofErr w:type="spellStart"/>
+      <w:r>
+        <w:t>removeSpaces</w:t>
+      </w:r>
+      <w:proofErr w:type="spellEnd"/>
+      <w:r>
+        <w:t xml:space="preserve"> e </w:t>
+      </w:r>
+      <w:proofErr w:type="spellStart"/>
+      <w:r>
+        <w:t>upperCaracters</w:t>
+      </w:r>
+      <w:proofErr w:type="spellEnd"/>
+      <w:r>
+        <w:t xml:space="preserve">,  as validações para a validade são date, </w:t>
+      </w:r>
+      <w:proofErr w:type="spellStart"/>
+      <w:r>
+        <w:t>email</w:t>
+      </w:r>
+      <w:proofErr w:type="spellEnd"/>
+      <w:r>
+        <w:t xml:space="preserve">, </w:t>
+      </w:r>
+      <w:proofErr w:type="spellStart"/>
+      <w:r>
+        <w:t>nullOrEmpty</w:t>
+      </w:r>
+      <w:proofErr w:type="spellEnd"/>
+      <w:r>
+        <w:t xml:space="preserve">, </w:t>
+      </w:r>
+      <w:proofErr w:type="spellStart"/>
+      <w:r>
+        <w:t>QtdCaracters</w:t>
+      </w:r>
+      <w:proofErr w:type="spellEnd"/>
+      <w:r>
+        <w:t xml:space="preserve"> e </w:t>
+      </w:r>
+      <w:proofErr w:type="spellStart"/>
+      <w:r>
+        <w:t>UfValidator</w:t>
+      </w:r>
+      <w:proofErr w:type="spellEnd"/>
+      <w:r>
+        <w:t>.</w:t>
+      </w:r>
+    </w:p>
+    <w:p>
+      <w:pPr>
+        <w:ind w:firstLine="708"/>
+      </w:pPr>
+      <w:bookmarkStart w:id="1" w:name="_GoBack"/>
+      <w:bookmarkEnd w:id="1"/>
       <w:r>
         <w:t xml:space="preserve"> </w:t>
       </w:r>
@@ -956,12 +1066,14 @@
     <w:p/>
     <w:p>
       <w:r>
-        <w:lastRenderedPageBreak/>
         <w:t xml:space="preserve">Lista religiões: </w:t>
       </w:r>
     </w:p>
     <w:p>
       <w:r>
+        <w:rPr>
+          <w:noProof/>
+        </w:rPr>
         <w:drawing>
           <wp:inline distT="0" distB="0" distL="0" distR="0" wp14:anchorId="382533E3" wp14:editId="09FD66DB">
             <wp:extent cx="2295845" cy="3896269"/>
@@ -1035,6 +1147,9 @@
     </w:p>
     <w:p>
       <w:r>
+        <w:rPr>
+          <w:noProof/>
+        </w:rPr>
         <w:drawing>
           <wp:inline distT="0" distB="0" distL="0" distR="0" wp14:anchorId="5224BD72" wp14:editId="0ACE64E3">
             <wp:extent cx="2962688" cy="1438476"/>
@@ -1080,6 +1195,10 @@
     </w:p>
     <w:p>
       <w:r>
+        <w:rPr>
+          <w:noProof/>
+        </w:rPr>
+        <w:lastRenderedPageBreak/>
         <w:drawing>
           <wp:inline distT="0" distB="0" distL="0" distR="0" wp14:anchorId="1FD89637" wp14:editId="631A2155">
             <wp:extent cx="2152950" cy="1457528"/>
@@ -1173,6 +1292,9 @@
     </w:p>
     <w:p>
       <w:r>
+        <w:rPr>
+          <w:noProof/>
+        </w:rPr>
         <w:drawing>
           <wp:inline distT="0" distB="0" distL="0" distR="0" wp14:anchorId="05A0C9EE" wp14:editId="40E25EFD">
             <wp:extent cx="3334215" cy="1381318"/>
@@ -1218,6 +1340,9 @@
     </w:p>
     <w:p>
       <w:r>
+        <w:rPr>
+          <w:noProof/>
+        </w:rPr>
         <w:drawing>
           <wp:inline distT="0" distB="0" distL="0" distR="0" wp14:anchorId="78AA080D" wp14:editId="62072978">
             <wp:extent cx="2867425" cy="1438476"/>
@@ -1263,6 +1388,9 @@
     </w:p>
     <w:p>
       <w:r>
+        <w:rPr>
+          <w:noProof/>
+        </w:rPr>
         <w:drawing>
           <wp:inline distT="0" distB="0" distL="0" distR="0" wp14:anchorId="6129B871" wp14:editId="418342E5">
             <wp:extent cx="3362794" cy="1057423"/>
@@ -1307,6 +1435,10 @@
     </w:p>
     <w:p>
       <w:r>
+        <w:rPr>
+          <w:noProof/>
+        </w:rPr>
+        <w:lastRenderedPageBreak/>
         <w:drawing>
           <wp:inline distT="0" distB="0" distL="0" distR="0" wp14:anchorId="57E4251F" wp14:editId="186F87D3">
             <wp:extent cx="2915057" cy="1038370"/>
@@ -1355,7 +1487,7 @@
 </file>
 
 <file path=word/endnotes.xml><?xml version="1.0" encoding="utf-8"?>
-<w:endnotes xmlns:wpc="http://schemas.microsoft.com/office/word/2010/wordprocessingCanvas" xmlns:cx="http://schemas.microsoft.com/office/drawing/2014/chartex" xmlns:cx1="http://schemas.microsoft.com/office/drawing/2015/9/8/chartex" xmlns:cx2="http://schemas.microsoft.com/office/drawing/2015/10/21/chartex" xmlns:cx3="http://schemas.microsoft.com/office/drawing/2016/5/9/chartex" xmlns:cx4="http://schemas.microsoft.com/office/drawing/2016/5/10/chartex" xmlns:cx5="http://schemas.microsoft.com/office/drawing/2016/5/11/chartex" xmlns:cx6="http://schemas.microsoft.com/office/drawing/2016/5/12/chartex" xmlns:cx7="http://schemas.microsoft.com/office/drawing/2016/5/13/chartex" xmlns:cx8="http://schemas.microsoft.com/office/drawing/2016/5/14/chartex" xmlns:mc="http://schemas.openxmlformats.org/markup-compatibility/2006" xmlns:aink="http://schemas.microsoft.com/office/drawing/2016/ink" xmlns:am3d="http://schemas.microsoft.com/office/drawing/2017/model3d" xmlns:o="urn:schemas-microsoft-com:office:office" xmlns:oel="http://schemas.microsoft.com/office/2019/extlst" xmlns:r="http://schemas.openxmlformats.org/officeDocument/2006/relationships" xmlns:m="http://schemas.openxmlformats.org/officeDocument/2006/math" xmlns:v="urn:schemas-microsoft-com:vml" xmlns:wp14="http://schemas.microsoft.com/office/word/2010/wordprocessingDrawing" xmlns:wp="http://schemas.openxmlformats.org/drawingml/2006/wordprocessingDrawing" xmlns:w10="urn:schemas-microsoft-com:office:word" xmlns:w="http://schemas.openxmlformats.org/wordprocessingml/2006/main" xmlns:w14="http://schemas.microsoft.com/office/word/2010/wordml" xmlns:w15="http://schemas.microsoft.com/office/word/2012/wordml" xmlns:w16cex="http://schemas.microsoft.com/office/word/2018/wordml/cex" xmlns:w16cid="http://schemas.microsoft.com/office/word/2016/wordml/cid" xmlns:w16="http://schemas.microsoft.com/office/word/2018/wordml" xmlns:w16du="http://schemas.microsoft.com/office/word/2023/wordml/word16du" xmlns:w16sdtdh="http://schemas.microsoft.com/office/word/2020/wordml/sdtdatahash" xmlns:w16sdtfl="http://schemas.microsoft.com/office/word/2024/wordml/sdtformatlock" xmlns:w16se="http://schemas.microsoft.com/office/word/2015/wordml/symex" xmlns:wpg="http://schemas.microsoft.com/office/word/2010/wordprocessingGroup" xmlns:wpi="http://schemas.microsoft.com/office/word/2010/wordprocessingInk" xmlns:wne="http://schemas.microsoft.com/office/word/2006/wordml" xmlns:wps="http://schemas.microsoft.com/office/word/2010/wordprocessingShape" mc:Ignorable="w14 w15 w16se w16cid w16 w16cex w16sdtdh w16sdtfl w16du wp14">
+<w:endnotes xmlns:wpc="http://schemas.microsoft.com/office/word/2010/wordprocessingCanvas" xmlns:cx="http://schemas.microsoft.com/office/drawing/2014/chartex" xmlns:cx1="http://schemas.microsoft.com/office/drawing/2015/9/8/chartex" xmlns:cx2="http://schemas.microsoft.com/office/drawing/2015/10/21/chartex" xmlns:cx3="http://schemas.microsoft.com/office/drawing/2016/5/9/chartex" xmlns:cx4="http://schemas.microsoft.com/office/drawing/2016/5/10/chartex" xmlns:cx5="http://schemas.microsoft.com/office/drawing/2016/5/11/chartex" xmlns:cx6="http://schemas.microsoft.com/office/drawing/2016/5/12/chartex" xmlns:cx7="http://schemas.microsoft.com/office/drawing/2016/5/13/chartex" xmlns:cx8="http://schemas.microsoft.com/office/drawing/2016/5/14/chartex" xmlns:mc="http://schemas.openxmlformats.org/markup-compatibility/2006" xmlns:aink="http://schemas.microsoft.com/office/drawing/2016/ink" xmlns:am3d="http://schemas.microsoft.com/office/drawing/2017/model3d" xmlns:o="urn:schemas-microsoft-com:office:office" xmlns:r="http://schemas.openxmlformats.org/officeDocument/2006/relationships" xmlns:m="http://schemas.openxmlformats.org/officeDocument/2006/math" xmlns:v="urn:schemas-microsoft-com:vml" xmlns:wp14="http://schemas.microsoft.com/office/word/2010/wordprocessingDrawing" xmlns:wp="http://schemas.openxmlformats.org/drawingml/2006/wordprocessingDrawing" xmlns:w10="urn:schemas-microsoft-com:office:word" xmlns:w="http://schemas.openxmlformats.org/wordprocessingml/2006/main" xmlns:w14="http://schemas.microsoft.com/office/word/2010/wordml" xmlns:w15="http://schemas.microsoft.com/office/word/2012/wordml" xmlns:w16cid="http://schemas.microsoft.com/office/word/2016/wordml/cid" xmlns:w16se="http://schemas.microsoft.com/office/word/2015/wordml/symex" xmlns:wpg="http://schemas.microsoft.com/office/word/2010/wordprocessingGroup" xmlns:wpi="http://schemas.microsoft.com/office/word/2010/wordprocessingInk" xmlns:wne="http://schemas.microsoft.com/office/word/2006/wordml" xmlns:wps="http://schemas.microsoft.com/office/word/2010/wordprocessingShape" mc:Ignorable="w14 w15 w16se w16cid wp14">
   <w:endnote w:type="separator" w:id="-1">
     <w:p>
       <w:pPr>
@@ -1380,7 +1512,7 @@
 </file>
 
 <file path=word/footnotes.xml><?xml version="1.0" encoding="utf-8"?>
-<w:footnotes xmlns:wpc="http://schemas.microsoft.com/office/word/2010/wordprocessingCanvas" xmlns:cx="http://schemas.microsoft.com/office/drawing/2014/chartex" xmlns:cx1="http://schemas.microsoft.com/office/drawing/2015/9/8/chartex" xmlns:cx2="http://schemas.microsoft.com/office/drawing/2015/10/21/chartex" xmlns:cx3="http://schemas.microsoft.com/office/drawing/2016/5/9/chartex" xmlns:cx4="http://schemas.microsoft.com/office/drawing/2016/5/10/chartex" xmlns:cx5="http://schemas.microsoft.com/office/drawing/2016/5/11/chartex" xmlns:cx6="http://schemas.microsoft.com/office/drawing/2016/5/12/chartex" xmlns:cx7="http://schemas.microsoft.com/office/drawing/2016/5/13/chartex" xmlns:cx8="http://schemas.microsoft.com/office/drawing/2016/5/14/chartex" xmlns:mc="http://schemas.openxmlformats.org/markup-compatibility/2006" xmlns:aink="http://schemas.microsoft.com/office/drawing/2016/ink" xmlns:am3d="http://schemas.microsoft.com/office/drawing/2017/model3d" xmlns:o="urn:schemas-microsoft-com:office:office" xmlns:oel="http://schemas.microsoft.com/office/2019/extlst" xmlns:r="http://schemas.openxmlformats.org/officeDocument/2006/relationships" xmlns:m="http://schemas.openxmlformats.org/officeDocument/2006/math" xmlns:v="urn:schemas-microsoft-com:vml" xmlns:wp14="http://schemas.microsoft.com/office/word/2010/wordprocessingDrawing" xmlns:wp="http://schemas.openxmlformats.org/drawingml/2006/wordprocessingDrawing" xmlns:w10="urn:schemas-microsoft-com:office:word" xmlns:w="http://schemas.openxmlformats.org/wordprocessingml/2006/main" xmlns:w14="http://schemas.microsoft.com/office/word/2010/wordml" xmlns:w15="http://schemas.microsoft.com/office/word/2012/wordml" xmlns:w16cex="http://schemas.microsoft.com/office/word/2018/wordml/cex" xmlns:w16cid="http://schemas.microsoft.com/office/word/2016/wordml/cid" xmlns:w16="http://schemas.microsoft.com/office/word/2018/wordml" xmlns:w16du="http://schemas.microsoft.com/office/word/2023/wordml/word16du" xmlns:w16sdtdh="http://schemas.microsoft.com/office/word/2020/wordml/sdtdatahash" xmlns:w16sdtfl="http://schemas.microsoft.com/office/word/2024/wordml/sdtformatlock" xmlns:w16se="http://schemas.microsoft.com/office/word/2015/wordml/symex" xmlns:wpg="http://schemas.microsoft.com/office/word/2010/wordprocessingGroup" xmlns:wpi="http://schemas.microsoft.com/office/word/2010/wordprocessingInk" xmlns:wne="http://schemas.microsoft.com/office/word/2006/wordml" xmlns:wps="http://schemas.microsoft.com/office/word/2010/wordprocessingShape" mc:Ignorable="w14 w15 w16se w16cid w16 w16cex w16sdtdh w16sdtfl w16du wp14">
+<w:footnotes xmlns:wpc="http://schemas.microsoft.com/office/word/2010/wordprocessingCanvas" xmlns:cx="http://schemas.microsoft.com/office/drawing/2014/chartex" xmlns:cx1="http://schemas.microsoft.com/office/drawing/2015/9/8/chartex" xmlns:cx2="http://schemas.microsoft.com/office/drawing/2015/10/21/chartex" xmlns:cx3="http://schemas.microsoft.com/office/drawing/2016/5/9/chartex" xmlns:cx4="http://schemas.microsoft.com/office/drawing/2016/5/10/chartex" xmlns:cx5="http://schemas.microsoft.com/office/drawing/2016/5/11/chartex" xmlns:cx6="http://schemas.microsoft.com/office/drawing/2016/5/12/chartex" xmlns:cx7="http://schemas.microsoft.com/office/drawing/2016/5/13/chartex" xmlns:cx8="http://schemas.microsoft.com/office/drawing/2016/5/14/chartex" xmlns:mc="http://schemas.openxmlformats.org/markup-compatibility/2006" xmlns:aink="http://schemas.microsoft.com/office/drawing/2016/ink" xmlns:am3d="http://schemas.microsoft.com/office/drawing/2017/model3d" xmlns:o="urn:schemas-microsoft-com:office:office" xmlns:r="http://schemas.openxmlformats.org/officeDocument/2006/relationships" xmlns:m="http://schemas.openxmlformats.org/officeDocument/2006/math" xmlns:v="urn:schemas-microsoft-com:vml" xmlns:wp14="http://schemas.microsoft.com/office/word/2010/wordprocessingDrawing" xmlns:wp="http://schemas.openxmlformats.org/drawingml/2006/wordprocessingDrawing" xmlns:w10="urn:schemas-microsoft-com:office:word" xmlns:w="http://schemas.openxmlformats.org/wordprocessingml/2006/main" xmlns:w14="http://schemas.microsoft.com/office/word/2010/wordml" xmlns:w15="http://schemas.microsoft.com/office/word/2012/wordml" xmlns:w16cid="http://schemas.microsoft.com/office/word/2016/wordml/cid" xmlns:w16se="http://schemas.microsoft.com/office/word/2015/wordml/symex" xmlns:wpg="http://schemas.microsoft.com/office/word/2010/wordprocessingGroup" xmlns:wpi="http://schemas.microsoft.com/office/word/2010/wordprocessingInk" xmlns:wne="http://schemas.microsoft.com/office/word/2006/wordml" xmlns:wps="http://schemas.microsoft.com/office/word/2010/wordprocessingShape" mc:Ignorable="w14 w15 w16se w16cid wp14">
   <w:footnote w:type="separator" w:id="-1">
     <w:p>
       <w:pPr>
@@ -1405,7 +1537,7 @@
 </file>
 
 <file path=word/styles.xml><?xml version="1.0" encoding="utf-8"?>
-<w:styles xmlns:mc="http://schemas.openxmlformats.org/markup-compatibility/2006" xmlns:r="http://schemas.openxmlformats.org/officeDocument/2006/relationships" xmlns:w="http://schemas.openxmlformats.org/wordprocessingml/2006/main" xmlns:w14="http://schemas.microsoft.com/office/word/2010/wordml" xmlns:w15="http://schemas.microsoft.com/office/word/2012/wordml" xmlns:w16cex="http://schemas.microsoft.com/office/word/2018/wordml/cex" xmlns:w16cid="http://schemas.microsoft.com/office/word/2016/wordml/cid" xmlns:w16="http://schemas.microsoft.com/office/word/2018/wordml" xmlns:w16du="http://schemas.microsoft.com/office/word/2023/wordml/word16du" xmlns:w16sdtdh="http://schemas.microsoft.com/office/word/2020/wordml/sdtdatahash" xmlns:w16sdtfl="http://schemas.microsoft.com/office/word/2024/wordml/sdtformatlock" xmlns:w16se="http://schemas.microsoft.com/office/word/2015/wordml/symex" mc:Ignorable="w14 w15 w16se w16cid w16 w16cex w16sdtdh w16sdtfl w16du">
+<w:styles xmlns:mc="http://schemas.openxmlformats.org/markup-compatibility/2006" xmlns:r="http://schemas.openxmlformats.org/officeDocument/2006/relationships" xmlns:w="http://schemas.openxmlformats.org/wordprocessingml/2006/main" xmlns:w14="http://schemas.microsoft.com/office/word/2010/wordml" xmlns:w15="http://schemas.microsoft.com/office/word/2012/wordml" xmlns:w16cid="http://schemas.microsoft.com/office/word/2016/wordml/cid" xmlns:w16se="http://schemas.microsoft.com/office/word/2015/wordml/symex" mc:Ignorable="w14 w15 w16se w16cid">
   <w:docDefaults>
     <w:rPrDefault>
       <w:rPr>
@@ -1423,7 +1555,7 @@
       </w:pPr>
     </w:pPrDefault>
   </w:docDefaults>
-  <w:latentStyles w:defLockedState="0" w:defUIPriority="99" w:defSemiHidden="0" w:defUnhideWhenUsed="0" w:defQFormat="0" w:count="376">
+  <w:latentStyles w:defLockedState="0" w:defUIPriority="99" w:defSemiHidden="0" w:defUnhideWhenUsed="0" w:defQFormat="0" w:count="375">
     <w:lsdException w:name="Normal" w:uiPriority="0" w:qFormat="1"/>
     <w:lsdException w:name="heading 1" w:uiPriority="9" w:qFormat="1"/>
     <w:lsdException w:name="heading 2" w:semiHidden="1" w:uiPriority="9" w:unhideWhenUsed="1" w:qFormat="1"/>
@@ -1799,7 +1931,6 @@
     <w:lsdException w:name="Smart Hyperlink" w:semiHidden="1" w:unhideWhenUsed="1"/>
     <w:lsdException w:name="Hashtag" w:semiHidden="1" w:unhideWhenUsed="1"/>
     <w:lsdException w:name="Unresolved Mention" w:semiHidden="1" w:unhideWhenUsed="1"/>
-    <w:lsdException w:name="Smart Link" w:semiHidden="1" w:unhideWhenUsed="1"/>
   </w:latentStyles>
   <w:style w:type="paragraph" w:default="1" w:styleId="Normal">
     <w:name w:val="Normal"/>

</xml_diff>

<commit_message>
:books: docs: Numero da documentação
</commit_message>
<xml_diff>
--- a/Documents/Documents/Sprint07_Task081_Implementar_Validacoes_para_a_Classe_Position.docx
+++ b/Documents/Documents/Sprint07_Task081_Implementar_Validacoes_para_a_Classe_Position.docx
@@ -241,9 +241,16 @@
                 <w:b/>
                 <w:bCs/>
               </w:rPr>
-              <w:t>SeniorCareManager-Backend</w:t>
+              <w:t>SeniorCareManager</w:t>
             </w:r>
             <w:proofErr w:type="spellEnd"/>
+            <w:r>
+              <w:rPr>
+                <w:b/>
+                <w:bCs/>
+              </w:rPr>
+              <w:t>-Backend</w:t>
+            </w:r>
           </w:p>
         </w:tc>
         <w:tc>
@@ -537,7 +544,10 @@
           </w:tcPr>
           <w:p>
             <w:r>
-              <w:t>83</w:t>
+              <w:t>8</w:t>
+            </w:r>
+            <w:r>
+              <w:t>1</w:t>
             </w:r>
           </w:p>
         </w:tc>
@@ -725,8 +735,13 @@
           </w:tcPr>
           <w:p>
             <w:r>
-              <w:t>83</w:t>
-            </w:r>
+              <w:t>8</w:t>
+            </w:r>
+            <w:r>
+              <w:t>1</w:t>
+            </w:r>
+            <w:bookmarkStart w:id="0" w:name="_GoBack"/>
+            <w:bookmarkEnd w:id="0"/>
           </w:p>
         </w:tc>
         <w:tc>
@@ -847,7 +862,7 @@
       <w:pPr>
         <w:ind w:firstLine="708"/>
       </w:pPr>
-      <w:bookmarkStart w:id="0" w:name="_Hlk200092608"/>
+      <w:bookmarkStart w:id="1" w:name="_Hlk200092608"/>
       <w:r>
         <w:t xml:space="preserve">Nessa </w:t>
       </w:r>
@@ -996,13 +1011,11 @@
       <w:pPr>
         <w:ind w:firstLine="708"/>
       </w:pPr>
-      <w:bookmarkStart w:id="1" w:name="_GoBack"/>
-      <w:bookmarkEnd w:id="1"/>
       <w:r>
         <w:t xml:space="preserve"> </w:t>
       </w:r>
     </w:p>
-    <w:bookmarkEnd w:id="0"/>
+    <w:bookmarkEnd w:id="1"/>
     <w:p>
       <w:r>
         <w:t>Diagrama de classe:</w:t>

</xml_diff>